<commit_message>
sync update cover letter
</commit_message>
<xml_diff>
--- a/gcmc_manuscript/cover letter/Cover Letter.docx
+++ b/gcmc_manuscript/cover letter/Cover Letter.docx
@@ -150,7 +150,31 @@
           <w:sz w:val="20"/>
           <w:lang w:val="en-US"/>
         </w:rPr>
-        <w:t>s by geographical cross mapping cardinality</w:t>
+        <w:t xml:space="preserve">s </w:t>
+      </w:r>
+      <w:r>
+        <w:rPr>
+          <w:rFonts w:ascii="Arial" w:hAnsi="Arial" w:cs="Arial"/>
+          <w:sz w:val="20"/>
+          <w:lang w:val="en-US"/>
+        </w:rPr>
+        <w:t>from spatial cross-sectional data</w:t>
+      </w:r>
+      <w:r>
+        <w:rPr>
+          <w:rFonts w:ascii="Arial" w:hAnsi="Arial" w:cs="Arial" w:hint="eastAsia"/>
+          <w:sz w:val="20"/>
+          <w:lang w:val="en-US" w:eastAsia="zh-CN"/>
+        </w:rPr>
+        <w:t xml:space="preserve"> </w:t>
+      </w:r>
+      <w:r>
+        <w:rPr>
+          <w:rFonts w:ascii="Arial" w:hAnsi="Arial" w:cs="Arial"/>
+          <w:sz w:val="20"/>
+          <w:lang w:val="en-US"/>
+        </w:rPr>
+        <w:t>by geographical cross mapping cardinality</w:t>
       </w:r>
       <w:r>
         <w:rPr>
@@ -2572,7 +2596,7 @@
         <w:sz w:val="18"/>
         <w:szCs w:val="18"/>
       </w:rPr>
-      <w:t>30 August 2025</w:t>
+      <w:t>3 January 2026</w:t>
     </w:r>
     <w:r>
       <w:rPr>
@@ -3740,7 +3764,6 @@
   <w:style w:type="character" w:default="1" w:styleId="a1">
     <w:name w:val="Default Paragraph Font"/>
     <w:uiPriority w:val="1"/>
-    <w:semiHidden/>
     <w:unhideWhenUsed/>
   </w:style>
   <w:style w:type="table" w:default="1" w:styleId="a2">

</xml_diff>